<commit_message>
同步 v1.1.5 技能文件: assets/reference.docx
</commit_message>
<xml_diff>
--- a/assets/reference.docx
+++ b/assets/reference.docx
@@ -1430,7 +1430,7 @@
               <w:rPr>
                 <w:rFonts w:ascii="微软雅黑" w:eastAsia="微软雅黑" w:hAnsi="微软雅黑" w:cs="Arial Unicode MS"/>
                 <w:b/>
-                <w:color w:val="333333"/>
+                <w:color w:val="FFFFFF"/>
                 <w:sz w:val="16"/>
               </w:rPr>
               <w:t xml:space="preserve">市场</w:t>
@@ -1467,7 +1467,7 @@
               <w:rPr>
                 <w:rFonts w:ascii="微软雅黑" w:eastAsia="微软雅黑" w:hAnsi="微软雅黑" w:cs="Arial Unicode MS"/>
                 <w:b/>
-                <w:color w:val="333333"/>
+                <w:color w:val="FFFFFF"/>
                 <w:sz w:val="16"/>
               </w:rPr>
               <w:t xml:space="preserve">指数（代码）</w:t>
@@ -1504,7 +1504,7 @@
               <w:rPr>
                 <w:rFonts w:ascii="微软雅黑" w:eastAsia="微软雅黑" w:hAnsi="微软雅黑" w:cs="Arial Unicode MS"/>
                 <w:b/>
-                <w:color w:val="333333"/>
+                <w:color w:val="FFFFFF"/>
                 <w:sz w:val="16"/>
               </w:rPr>
               <w:t xml:space="preserve">上月涨跌幅</w:t>
@@ -1541,7 +1541,7 @@
               <w:rPr>
                 <w:rFonts w:ascii="微软雅黑" w:eastAsia="微软雅黑" w:hAnsi="微软雅黑" w:cs="Arial Unicode MS"/>
                 <w:b/>
-                <w:color w:val="333333"/>
+                <w:color w:val="FFFFFF"/>
                 <w:sz w:val="16"/>
               </w:rPr>
               <w:t xml:space="preserve">近两月累计涨跌幅</w:t>

</xml_diff>